<commit_message>
Update healthcare security positioning and Oneida profile
Apply the requested Healthcare Cloud Security & Purple Team Engineer headline across current profile labels. Refresh About and section introductions, retain authorized-learning and project-evidence distinctions, and update the public location to Oneida, New York.

Reconcile both resume downloads with the profile, user-confirmed contact details, AWS exam version and education wording. Preserve historical employment, article content, project links, design and hosting configuration.
</commit_message>
<xml_diff>
--- a/assets/resume/Peter_Agbenyega_Resume.docx
+++ b/assets/resume/Peter_Agbenyega_Resume.docx
@@ -26,7 +26,7 @@
           <w:b/>
           <w:sz w:val="21"/>
         </w:rPr>
-        <w:t>CLOUD / INFRASTRUCTURE / DEVOPS / CYBERSECURITY CANDIDATE</w:t>
+        <w:t>HEALTHCARE CLOUD SECURITY &amp; PURPLE TEAM ENGINEER</w:t>
       </w:r>
     </w:p>
     <w:p>
@@ -38,7 +38,7 @@
         <w:rPr>
           <w:sz w:val="18"/>
         </w:rPr>
-        <w:t>Oneida, NY | 315-941-5498 | peter.cagbenyega@gmail.com</w:t>
+        <w:t>Oneida, New York | 315-316-5855 | peter.cagbenyega@gmail.com</w:t>
         <w:br/>
         <w:t>petercagbenyega.com | github.com/Peter-Agbenyega</w:t>
       </w:r>
@@ -71,7 +71,7 @@
         <w:spacing w:after="30"/>
       </w:pPr>
       <w:r>
-        <w:t>Cloud and cybersecurity graduate student with AWS architecture and security certifications, hands-on infrastructure-as-code and secure delivery projects, and a background in regulated operations and education. Targeting internship or early-career opportunities across cloud engineering, infrastructure, DevOps, systems, platform engineering, and cybersecurity. Comfortable learning quickly, documenting work clearly, and operating within structured technical processes.</w:t>
+        <w:t>Cloud and cybersecurity professional with AWS architecture and security certifications, infrastructure-as-code and secure delivery projects, and experience in regulated human services. Pursuing graduate study in Cloud Computing Systems at UMGC. Developing ethical-hacking, penetration-testing and purple-team skills through authorized training, with a growing focus on healthcare cybersecurity and reliable health IT.</w:t>
       </w:r>
     </w:p>
     <w:p>
@@ -97,7 +97,9 @@
         <w:rPr>
           <w:sz w:val="17"/>
         </w:rPr>
-        <w:t>AWS • Terraform • Infrastructure as Code • Docker • Kubernetes • Linux • GitHub Actions • CI/CD • IAM • Networking • Cloud Security • DevSecOps • Python • Git/GitHub • Security Testing</w:t>
+        <w:t>AWS • Terraform • Infrastructure as Code • Docker • Kubernetes • Linux • GitHub Actions • CI/CD • IAM • Networking • Cloud Security • DevSecOps • Python • Git/GitHub</w:t>
+        <w:br/>
+        <w:t>Developing: ethical hacking, penetration testing and purple teaming in authorized labs.</w:t>
       </w:r>
     </w:p>
     <w:p>
@@ -240,7 +242,7 @@
         <w:rPr>
           <w:sz w:val="18"/>
         </w:rPr>
-        <w:t>Built and deployed a web application using a modern cloud delivery workflow, with structured product flows and production-oriented deployment practices.</w:t>
+        <w:t>Web application project using a modern cloud delivery workflow and structured product flows; production use and adoption require separate evidence.</w:t>
       </w:r>
     </w:p>
     <w:p>
@@ -266,7 +268,7 @@
         <w:rPr>
           <w:sz w:val="17"/>
         </w:rPr>
-        <w:t>AWS Certified Solutions Architect - Associate (SAA-C03) | AWS Certified Solutions Architect - Professional (SAP-C02) | AWS Certified Security - Specialty (SCS-C02)</w:t>
+        <w:t>AWS Certified Solutions Architect - Associate (SAA-C02) | AWS Certified Solutions Architect - Professional (SAP-C02) | AWS Certified Security - Specialty (SCS-C02)</w:t>
       </w:r>
     </w:p>
     <w:p>
@@ -329,13 +331,12 @@
           <w:b/>
           <w:sz w:val="18"/>
         </w:rPr>
-        <w:t>Bachelor's in Basic Education</w:t>
+        <w:t>Bachelor of Education in Basic Education - Mathematics major | University of Education, Winneba</w:t>
       </w:r>
       <w:r>
         <w:rPr>
           <w:sz w:val="18"/>
         </w:rPr>
-        <w:t xml:space="preserve"> | Ghana</w:t>
       </w:r>
     </w:p>
     <w:p>

</xml_diff>